<commit_message>
feat: add bounded context epoch recovery
</commit_message>
<xml_diff>
--- a/docs/ANODEX_CONTEXT_EPOCH_RECOVERY_PLAN.docx
+++ b/docs/ANODEX_CONTEXT_EPOCH_RECOVERY_PLAN.docx
@@ -730,13 +730,13 @@
           <w:b/>
           <w:color w:val="0B2545"/>
         </w:rPr>
-        <w:t xml:space="preserve">Durable truth over transcript: </w:t>
+        <w:t xml:space="preserve">Protected handoff over transcript: </w:t>
       </w:r>
       <w:r>
         <w:rPr>
           <w:rFonts w:ascii="Calibri" w:hAnsi="Calibri"/>
         </w:rPr>
-        <w:t>Workspace files, checkpoints, tool records, and a structured handoff are the source of truth. The next epoch may re-read a precise file range when it needs details; it must not depend on a giant transcript.</w:t>
+        <w:t>Workspace files, checkpoints, tool records, and a structured handoff are the source of truth. The handoff is an exact, protected provider-context block, not an ordinary history turn subject to rolling summarization. It has a token cap derived from the selected context size.</w:t>
       </w:r>
     </w:p>
     <w:p>
@@ -1000,7 +1000,7 @@
                 <w:color w:val="20242A"/>
                 <w:sz w:val="19"/>
               </w:rPr>
-              <w:t>When the next round would threaten the configured reply reserve or exceed an epoch tool-call budget, request a context epoch at the next safe boundary.</w:t>
+              <w:t>When the next round would threaten the reply reserve, exhaust safe reclaim tiers, or exceed an epoch tool-call budget, request a context epoch at the next safe boundary.</w:t>
             </w:r>
           </w:p>
         </w:tc>
@@ -1025,7 +1025,7 @@
                 <w:color w:val="20242A"/>
                 <w:sz w:val="19"/>
               </w:rPr>
-              <w:t>This turns a predictable capacity event into a controlled transition rather than a hard stop.</w:t>
+              <w:t>The threshold is derived from the reply reserve plus headroom for a permitted tool result, rather than a context-size percentage that can become unusable at 16K.</w:t>
             </w:r>
           </w:p>
         </w:tc>
@@ -1077,7 +1077,7 @@
                 <w:color w:val="20242A"/>
                 <w:sz w:val="19"/>
               </w:rPr>
-              <w:t>Persist a compact structured record and, when useful, produce a bounded model summary with tools disabled.</w:t>
+              <w:t>Persist a compact structured record in a protected, separately budgeted provider-context block; use a bounded tools-disabled summary only as a supplement.</w:t>
             </w:r>
           </w:p>
         </w:tc>
@@ -1102,7 +1102,7 @@
                 <w:color w:val="20242A"/>
                 <w:sz w:val="19"/>
               </w:rPr>
-              <w:t>A deterministic record prevents loss of file paths, task state, and verification requirements; a short summary preserves nuance.</w:t>
+              <w:t>A deterministic record prevents loss of file paths, task state, and verification requirements because rolling history compaction cannot rewrite it.</w:t>
             </w:r>
           </w:p>
         </w:tc>
@@ -1154,7 +1154,7 @@
                 <w:color w:val="20242A"/>
                 <w:sz w:val="19"/>
               </w:rPr>
-              <w:t>Create a fresh model request with the current system instructions, task handoff, current prompt, and only a bounded recent tail.</w:t>
+              <w:t>Use the existing bounded-history and rolling-summary seam for ordinary history, then render the protected handoff, current instructions, and bounded recent tail. Measure it before accepting the epoch.</w:t>
             </w:r>
           </w:p>
         </w:tc>
@@ -1179,7 +1179,7 @@
                 <w:color w:val="20242A"/>
                 <w:sz w:val="19"/>
               </w:rPr>
-              <w:t>The new request has substantial reply room while the model still knows what to do next.</w:t>
+              <w:t>History compaction retains one owner. The protected handoff has a separate owner and cannot be evicted or re-summarized.</w:t>
             </w:r>
           </w:p>
         </w:tc>
@@ -1586,7 +1586,7 @@
                 <w:color w:val="20242A"/>
                 <w:sz w:val="19"/>
               </w:rPr>
-              <w:t>Successful mutations, changed paths, commands/checks that passed, and verified observations.</w:t>
+              <w:t>Successful mutations, changed paths and content hashes, commands/checks that passed, verified observations, and terminal approvals or denials.</w:t>
             </w:r>
           </w:p>
         </w:tc>
@@ -1611,7 +1611,7 @@
                 <w:color w:val="20242A"/>
                 <w:sz w:val="19"/>
               </w:rPr>
-              <w:t>Allows continuation without redoing successful work.</w:t>
+              <w:t>Allows continuation without redoing successful work or asking the same approval twice.</w:t>
             </w:r>
           </w:p>
         </w:tc>
@@ -1817,7 +1817,7 @@
                 <w:color w:val="20242A"/>
                 <w:sz w:val="19"/>
               </w:rPr>
-              <w:t>Epoch number, compaction cause, estimated/measured token accounting, and number of tool calls collapsed.</w:t>
+              <w:t>Epoch number, compaction cause, measured per-round token accounting, image-part count, tool calls collapsed, an epoch-scoped recovery-read budget, and the estimator correction used.</w:t>
             </w:r>
           </w:p>
         </w:tc>
@@ -1842,7 +1842,7 @@
                 <w:color w:val="20242A"/>
                 <w:sz w:val="19"/>
               </w:rPr>
-              <w:t>Supports debugging and makes the transition auditable.</w:t>
+              <w:t>Supports debugging, makes the transition auditable, and prevents old-context facts from blocking a small number of necessary recovery reads.</w:t>
             </w:r>
           </w:p>
         </w:tc>
@@ -2447,7 +2447,7 @@
         <w:rPr>
           <w:rFonts w:ascii="Calibri" w:hAnsi="Calibri"/>
         </w:rPr>
-        <w:t>Conversation id, model id, projector presence, context size, GPU layer setting, epoch number, active/deferred tool count, tool-call count, image count, measured fixed tokens, requested/effective output allowance, cause, recovery attempt, runtime exit signal/code, and a bounded runtime output tail.</w:t>
+        <w:t>One matched record per provider round: conversation id, model id, projector presence, context size, GPU layer setting, epoch number, round index, active/deferred tool count, settled tool-call count, image-part count, measured fixed tokens, input limit, requested/effective output allowance, cause, recovery attempt, runtime exit signal/code, and a bounded runtime output tail.</w:t>
       </w:r>
     </w:p>
     <w:p>
@@ -2485,7 +2485,26 @@
         <w:rPr>
           <w:rFonts w:ascii="Calibri" w:hAnsi="Calibri"/>
         </w:rPr>
-        <w:t>The incident was initially described as likely out-of-memory even though the final stop was context capacity. Exact context diagnostics remove that ambiguity without adding permanent resource-monitoring overhead.</w:t>
+        <w:t>The incident was initially described as likely out-of-memory even though the final stop was context capacity. Matched per-round values prevent comparing a final fixed-token count with an earlier output budget. Exact diagnostics remove ambiguity without adding permanent resource-monitoring overhead.</w:t>
+      </w:r>
+    </w:p>
+    <w:p>
+      <w:pPr>
+        <w:spacing w:after="80"/>
+      </w:pPr>
+      <w:r>
+        <w:rPr>
+          <w:rFonts w:ascii="Calibri" w:hAnsi="Calibri"/>
+          <w:b/>
+          <w:color w:val="0B2545"/>
+        </w:rPr>
+        <w:t xml:space="preserve">Estimator check: </w:t>
+      </w:r>
+      <w:r>
+        <w:rPr>
+          <w:rFonts w:ascii="Calibri" w:hAnsi="Calibri"/>
+        </w:rPr>
+        <w:t>Consume structured OpenAI-compatible usage.prompt_tokens when the streamed response supplies it. Log the bounded estimator difference and apply a capped per-conversation correction only to the next round; never parse arbitrary runtime text or use a later usage field to change the current request.</w:t>
       </w:r>
     </w:p>
     <w:p>
@@ -2516,13 +2535,13 @@
           <w:b/>
           <w:color w:val="0B2545"/>
         </w:rPr>
-        <w:t xml:space="preserve">Trigger A - reply reserve: </w:t>
+        <w:t xml:space="preserve">Trigger A - scaled reserve: </w:t>
       </w:r>
       <w:r>
         <w:rPr>
           <w:rFonts w:ascii="Calibri" w:hAnsi="Calibri"/>
         </w:rPr>
-        <w:t>Transition when measured input plus a conservative next-round allowance would leave less than the minimum useful reply reserve.</w:t>
+        <w:t>Compute a context-scaled useful reply reserve with a small absolute floor and a size-based fraction. Derive the early boundary as inputLimit minus that reserve minus reclaim headroom for the largest permitted next tool result. Test 4K, 8K, 16K, and 32K so a minimal tool-free request can receive non-zero output at 4K while a genuinely oversized fixed surface still fails clearly.</w:t>
       </w:r>
     </w:p>
     <w:p>
@@ -2560,7 +2579,26 @@
         <w:rPr>
           <w:rFonts w:ascii="Calibri" w:hAnsi="Calibri"/>
         </w:rPr>
-        <w:t>Transition after repeated in-turn tool-result reclamation within the same epoch. Reclamation is a signal that the exchange is no longer a good working set.</w:t>
+        <w:t>Transition after repeated in-turn tool-result reclamation within the same epoch. Reclamation is a signal that the exchange is no longer a good working set. Before declaring failure, reclaim old injected visual-inspection images as well as old tool-result text, retaining only the newest needed image reference.</w:t>
+      </w:r>
+    </w:p>
+    <w:p>
+      <w:pPr>
+        <w:spacing w:after="80"/>
+      </w:pPr>
+      <w:r>
+        <w:rPr>
+          <w:rFonts w:ascii="Calibri" w:hAnsi="Calibri"/>
+          <w:b/>
+          <w:color w:val="0B2545"/>
+        </w:rPr>
+        <w:t xml:space="preserve">Round-zero dominance: </w:t>
+      </w:r>
+      <w:r>
+        <w:rPr>
+          <w:rFonts w:ascii="Calibri" w:hAnsi="Calibri"/>
+        </w:rPr>
+        <w:t>Measure the rebuilt request before its first provider round. Return fixed-overhead dominance only when measured fixed components - current instructions, routed schemas, pinned images, and protected handoff - truly exceed the derived boundary. Do not misclassify a reserve larger than a small context window as a fixed-input failure.</w:t>
       </w:r>
     </w:p>
     <w:p>
@@ -2597,7 +2635,7 @@
         <w:rPr>
           <w:rFonts w:ascii="Calibri" w:hAnsi="Calibri"/>
         </w:rPr>
-        <w:t>Create a small, versioned ContextEpochHandoff record. Build its objective, plan state, changed files, verification requirements, and tool progress deterministically from existing state. Use an optional tools-disabled summary only to add concise reasoning or uncertainties that cannot be reconstructed mechanically.</w:t>
+        <w:t>Create a small, versioned ContextEpochHandoff record. Render it through a dedicated protected context block outside ordinary history splitting, and cap it in tokens from the selected context size. Build its objective, plan state, changed files, verification requirements, and tool progress deterministically from existing state. Use an optional tools-disabled summary only to add concise reasoning or uncertainties that cannot be reconstructed mechanically.</w:t>
       </w:r>
     </w:p>
     <w:p>
@@ -2654,7 +2692,7 @@
         <w:rPr>
           <w:rFonts w:ascii="Calibri" w:hAnsi="Calibri"/>
         </w:rPr>
-        <w:t>The fresh epoch receives the current system prompt, current settings, the handoff, and at most a small recent tail. It never receives raw image bytes from an older epoch unless the user explicitly pinned an image for continued visual context.</w:t>
+        <w:t>The fresh epoch uses existing bounded-history projection for ordinary history plus the current prompt, settings, and protected handoff. It must pass a preflight assertion that its measured initial request is smaller than the prior epoch. If char-based projection and tokenizer measurement disagree, re-bound once using a capped measured-to-estimated correction before any terminal verdict. It never receives raw image bytes from an older epoch unless the user explicitly pinned an image for continued visual context.</w:t>
       </w:r>
     </w:p>
     <w:p>
@@ -2710,7 +2748,7 @@
         <w:rPr>
           <w:rFonts w:ascii="Calibri" w:hAnsi="Calibri"/>
         </w:rPr>
-        <w:t>Carry tool settlement ids and checkpoint references into the handoff. The resumed model must be told which writes already succeeded so it does not repeat a non-idempotent action.</w:t>
+        <w:t>Carry normalized mutation evidence: path, operation kind, content hash/checkpoint, and outcome. Treat matching commands as evidence to inspect before retrying, not as an automatic skip, because commands can be time-sensitive or intentionally repeatable.</w:t>
       </w:r>
     </w:p>
     <w:p>
@@ -2729,7 +2767,45 @@
         <w:rPr>
           <w:rFonts w:ascii="Calibri" w:hAnsi="Calibri"/>
         </w:rPr>
-        <w:t>Carry the last mutation and last visual-verification ordering. A new epoch must still require post-change evidence before it can declare a rendered feature fixed.</w:t>
+        <w:t>Seed epoch progress with a monotonic completed-call counter and carried last-mutation/last-visual-verification sequence values. A new epoch must still require post-change evidence before it can declare a rendered feature fixed.</w:t>
+      </w:r>
+    </w:p>
+    <w:p>
+      <w:pPr>
+        <w:spacing w:after="80"/>
+      </w:pPr>
+      <w:r>
+        <w:rPr>
+          <w:rFonts w:ascii="Calibri" w:hAnsi="Calibri"/>
+          <w:b/>
+          <w:color w:val="0B2545"/>
+        </w:rPr>
+        <w:t xml:space="preserve">Recovery-read safety: </w:t>
+      </w:r>
+      <w:r>
+        <w:rPr>
+          <w:rFonts w:ascii="Calibri" w:hAnsi="Calibri"/>
+        </w:rPr>
+        <w:t>Keep ordinary read deduplication inside an epoch, but allow a small capped number of precise recovery reads for any evidence region dropped from active context. Treat those authorized reads as valid progress in both the coverage and bounded-run activity ledgers; do not reset the general loop guard.</w:t>
+      </w:r>
+    </w:p>
+    <w:p>
+      <w:pPr>
+        <w:spacing w:after="80"/>
+      </w:pPr>
+      <w:r>
+        <w:rPr>
+          <w:rFonts w:ascii="Calibri" w:hAnsi="Calibri"/>
+          <w:b/>
+          <w:color w:val="0B2545"/>
+        </w:rPr>
+        <w:t xml:space="preserve">Settlement safety: </w:t>
+      </w:r>
+      <w:r>
+        <w:rPr>
+          <w:rFonts w:ascii="Calibri" w:hAnsi="Calibri"/>
+        </w:rPr>
+        <w:t>Capture normalized command identity, write hashes, and outcomes at terminal tool settlement, before any in-turn argument reclamation. Handoff creation refuses any non-terminal tool call. Cancellation records its real reason and never rewrites it as an Anodex-close interruption.</w:t>
       </w:r>
     </w:p>
     <w:p>
@@ -2907,7 +2983,7 @@
                 <w:color w:val="20242A"/>
                 <w:sz w:val="19"/>
               </w:rPr>
-              <w:t>A prompt with tool schemas and tool-call arguments near a 16K limit.</w:t>
+              <w:t>Scaled reserve at 4K, 8K, 16K, and 32K.</w:t>
             </w:r>
           </w:p>
         </w:tc>
@@ -2932,7 +3008,315 @@
                 <w:color w:val="20242A"/>
                 <w:sz w:val="19"/>
               </w:rPr>
-              <w:t>The epoch decision occurs before the provider refuses the next request.</w:t>
+              <w:t>A minimal 4K tool-free request receives non-zero output; the early boundary precedes hard stop by permitted tool-result headroom at supported tool surfaces.</w:t>
+            </w:r>
+          </w:p>
+        </w:tc>
+      </w:tr>
+      <w:tr>
+        <w:tc>
+          <w:tcPr>
+            <w:tcW w:type="dxa" w:w="1450"/>
+            <w:tcMar>
+              <w:top w:w="80" w:type="dxa"/>
+              <w:start w:w="120" w:type="dxa"/>
+              <w:bottom w:w="80" w:type="dxa"/>
+              <w:end w:w="120" w:type="dxa"/>
+            </w:tcMar>
+            <w:vAlign w:val="center"/>
+          </w:tcPr>
+          <w:p>
+            <w:pPr>
+              <w:spacing w:after="0" w:line="259" w:lineRule="auto"/>
+            </w:pPr>
+            <w:r>
+              <w:rPr>
+                <w:rFonts w:ascii="Calibri" w:hAnsi="Calibri"/>
+                <w:color w:val="20242A"/>
+                <w:sz w:val="19"/>
+              </w:rPr>
+              <w:t>Unit</w:t>
+            </w:r>
+          </w:p>
+        </w:tc>
+        <w:tc>
+          <w:tcPr>
+            <w:tcW w:type="dxa" w:w="4500"/>
+            <w:tcMar>
+              <w:top w:w="80" w:type="dxa"/>
+              <w:start w:w="120" w:type="dxa"/>
+              <w:bottom w:w="80" w:type="dxa"/>
+              <w:end w:w="120" w:type="dxa"/>
+            </w:tcMar>
+            <w:vAlign w:val="center"/>
+          </w:tcPr>
+          <w:p>
+            <w:pPr>
+              <w:spacing w:after="0" w:line="259" w:lineRule="auto"/>
+            </w:pPr>
+            <w:r>
+              <w:rPr>
+                <w:rFonts w:ascii="Calibri" w:hAnsi="Calibri"/>
+                <w:color w:val="20242A"/>
+                <w:sz w:val="19"/>
+              </w:rPr>
+              <w:t>An 8K epoch whose ordinary history exceeds budget.</w:t>
+            </w:r>
+          </w:p>
+        </w:tc>
+        <w:tc>
+          <w:tcPr>
+            <w:tcW w:type="dxa" w:w="3410"/>
+            <w:tcMar>
+              <w:top w:w="80" w:type="dxa"/>
+              <w:start w:w="120" w:type="dxa"/>
+              <w:bottom w:w="80" w:type="dxa"/>
+              <w:end w:w="120" w:type="dxa"/>
+            </w:tcMar>
+            <w:vAlign w:val="center"/>
+          </w:tcPr>
+          <w:p>
+            <w:pPr>
+              <w:spacing w:after="0" w:line="259" w:lineRule="auto"/>
+            </w:pPr>
+            <w:r>
+              <w:rPr>
+                <w:rFonts w:ascii="Calibri" w:hAnsi="Calibri"/>
+                <w:color w:val="20242A"/>
+                <w:sz w:val="19"/>
+              </w:rPr>
+              <w:t>The protected handoff objective, changed paths, hashes, and verification requirement survive byte-identically while older history is summarized.</w:t>
+            </w:r>
+          </w:p>
+        </w:tc>
+      </w:tr>
+      <w:tr>
+        <w:tc>
+          <w:tcPr>
+            <w:tcW w:type="dxa" w:w="1450"/>
+            <w:tcMar>
+              <w:top w:w="80" w:type="dxa"/>
+              <w:start w:w="120" w:type="dxa"/>
+              <w:bottom w:w="80" w:type="dxa"/>
+              <w:end w:w="120" w:type="dxa"/>
+            </w:tcMar>
+            <w:vAlign w:val="center"/>
+          </w:tcPr>
+          <w:p>
+            <w:pPr>
+              <w:spacing w:after="0" w:line="259" w:lineRule="auto"/>
+            </w:pPr>
+            <w:r>
+              <w:rPr>
+                <w:rFonts w:ascii="Calibri" w:hAnsi="Calibri"/>
+                <w:color w:val="20242A"/>
+                <w:sz w:val="19"/>
+              </w:rPr>
+              <w:t>Unit</w:t>
+            </w:r>
+          </w:p>
+        </w:tc>
+        <w:tc>
+          <w:tcPr>
+            <w:tcW w:type="dxa" w:w="4500"/>
+            <w:tcMar>
+              <w:top w:w="80" w:type="dxa"/>
+              <w:start w:w="120" w:type="dxa"/>
+              <w:bottom w:w="80" w:type="dxa"/>
+              <w:end w:w="120" w:type="dxa"/>
+            </w:tcMar>
+            <w:vAlign w:val="center"/>
+          </w:tcPr>
+          <w:p>
+            <w:pPr>
+              <w:spacing w:after="0" w:line="259" w:lineRule="auto"/>
+            </w:pPr>
+            <w:r>
+              <w:rPr>
+                <w:rFonts w:ascii="Calibri" w:hAnsi="Calibri"/>
+                <w:color w:val="20242A"/>
+                <w:sz w:val="19"/>
+              </w:rPr>
+              <w:t>A rebuilt epoch with a large handoff or pinned image.</w:t>
+            </w:r>
+          </w:p>
+        </w:tc>
+        <w:tc>
+          <w:tcPr>
+            <w:tcW w:type="dxa" w:w="3410"/>
+            <w:tcMar>
+              <w:top w:w="80" w:type="dxa"/>
+              <w:start w:w="120" w:type="dxa"/>
+              <w:bottom w:w="80" w:type="dxa"/>
+              <w:end w:w="120" w:type="dxa"/>
+            </w:tcMar>
+            <w:vAlign w:val="center"/>
+          </w:tcPr>
+          <w:p>
+            <w:pPr>
+              <w:spacing w:after="0" w:line="259" w:lineRule="auto"/>
+            </w:pPr>
+            <w:r>
+              <w:rPr>
+                <w:rFonts w:ascii="Calibri" w:hAnsi="Calibri"/>
+                <w:color w:val="20242A"/>
+                <w:sz w:val="19"/>
+              </w:rPr>
+              <w:t>Round-zero preflight either proves a smaller request with useful reply room, re-bounds once for estimator skew, or returns true fixed-overhead dominance exactly once.</w:t>
+            </w:r>
+          </w:p>
+        </w:tc>
+      </w:tr>
+      <w:tr>
+        <w:tc>
+          <w:tcPr>
+            <w:tcW w:type="dxa" w:w="1450"/>
+            <w:tcMar>
+              <w:top w:w="80" w:type="dxa"/>
+              <w:start w:w="120" w:type="dxa"/>
+              <w:bottom w:w="80" w:type="dxa"/>
+              <w:end w:w="120" w:type="dxa"/>
+            </w:tcMar>
+            <w:vAlign w:val="center"/>
+          </w:tcPr>
+          <w:p>
+            <w:pPr>
+              <w:spacing w:after="0" w:line="259" w:lineRule="auto"/>
+            </w:pPr>
+            <w:r>
+              <w:rPr>
+                <w:rFonts w:ascii="Calibri" w:hAnsi="Calibri"/>
+                <w:color w:val="20242A"/>
+                <w:sz w:val="19"/>
+              </w:rPr>
+              <w:t>Unit</w:t>
+            </w:r>
+          </w:p>
+        </w:tc>
+        <w:tc>
+          <w:tcPr>
+            <w:tcW w:type="dxa" w:w="4500"/>
+            <w:tcMar>
+              <w:top w:w="80" w:type="dxa"/>
+              <w:start w:w="120" w:type="dxa"/>
+              <w:bottom w:w="80" w:type="dxa"/>
+              <w:end w:w="120" w:type="dxa"/>
+            </w:tcMar>
+            <w:vAlign w:val="center"/>
+          </w:tcPr>
+          <w:p>
+            <w:pPr>
+              <w:spacing w:after="0" w:line="259" w:lineRule="auto"/>
+            </w:pPr>
+            <w:r>
+              <w:rPr>
+                <w:rFonts w:ascii="Calibri" w:hAnsi="Calibri"/>
+                <w:color w:val="20242A"/>
+                <w:sz w:val="19"/>
+              </w:rPr>
+              <w:t>JSON-heavy history whose tokenizer count exceeds character estimate by 30 percent.</w:t>
+            </w:r>
+          </w:p>
+        </w:tc>
+        <w:tc>
+          <w:tcPr>
+            <w:tcW w:type="dxa" w:w="3410"/>
+            <w:tcMar>
+              <w:top w:w="80" w:type="dxa"/>
+              <w:start w:w="120" w:type="dxa"/>
+              <w:bottom w:w="80" w:type="dxa"/>
+              <w:end w:w="120" w:type="dxa"/>
+            </w:tcMar>
+            <w:vAlign w:val="center"/>
+          </w:tcPr>
+          <w:p>
+            <w:pPr>
+              <w:spacing w:after="0" w:line="259" w:lineRule="auto"/>
+            </w:pPr>
+            <w:r>
+              <w:rPr>
+                <w:rFonts w:ascii="Calibri" w:hAnsi="Calibri"/>
+                <w:color w:val="20242A"/>
+                <w:sz w:val="19"/>
+              </w:rPr>
+              <w:t>One correction-aware re-bound produces a smaller request and continues; it is not misreported as fixed-overhead dominance.</w:t>
+            </w:r>
+          </w:p>
+        </w:tc>
+      </w:tr>
+      <w:tr>
+        <w:tc>
+          <w:tcPr>
+            <w:tcW w:type="dxa" w:w="1450"/>
+            <w:tcMar>
+              <w:top w:w="80" w:type="dxa"/>
+              <w:start w:w="120" w:type="dxa"/>
+              <w:bottom w:w="80" w:type="dxa"/>
+              <w:end w:w="120" w:type="dxa"/>
+            </w:tcMar>
+            <w:vAlign w:val="center"/>
+          </w:tcPr>
+          <w:p>
+            <w:pPr>
+              <w:spacing w:after="0" w:line="259" w:lineRule="auto"/>
+            </w:pPr>
+            <w:r>
+              <w:rPr>
+                <w:rFonts w:ascii="Calibri" w:hAnsi="Calibri"/>
+                <w:color w:val="20242A"/>
+                <w:sz w:val="19"/>
+              </w:rPr>
+              <w:t>Unit</w:t>
+            </w:r>
+          </w:p>
+        </w:tc>
+        <w:tc>
+          <w:tcPr>
+            <w:tcW w:type="dxa" w:w="4500"/>
+            <w:tcMar>
+              <w:top w:w="80" w:type="dxa"/>
+              <w:start w:w="120" w:type="dxa"/>
+              <w:bottom w:w="80" w:type="dxa"/>
+              <w:end w:w="120" w:type="dxa"/>
+            </w:tcMar>
+            <w:vAlign w:val="center"/>
+          </w:tcPr>
+          <w:p>
+            <w:pPr>
+              <w:spacing w:after="0" w:line="259" w:lineRule="auto"/>
+            </w:pPr>
+            <w:r>
+              <w:rPr>
+                <w:rFonts w:ascii="Calibri" w:hAnsi="Calibri"/>
+                <w:color w:val="20242A"/>
+                <w:sz w:val="19"/>
+              </w:rPr>
+              <w:t>Streamed structured usage.prompt_tokens above the estimate.</w:t>
+            </w:r>
+          </w:p>
+        </w:tc>
+        <w:tc>
+          <w:tcPr>
+            <w:tcW w:type="dxa" w:w="3410"/>
+            <w:tcMar>
+              <w:top w:w="80" w:type="dxa"/>
+              <w:start w:w="120" w:type="dxa"/>
+              <w:bottom w:w="80" w:type="dxa"/>
+              <w:end w:w="120" w:type="dxa"/>
+            </w:tcMar>
+            <w:vAlign w:val="center"/>
+          </w:tcPr>
+          <w:p>
+            <w:pPr>
+              <w:spacing w:after="0" w:line="259" w:lineRule="auto"/>
+            </w:pPr>
+            <w:r>
+              <w:rPr>
+                <w:rFonts w:ascii="Calibri" w:hAnsi="Calibri"/>
+                <w:color w:val="20242A"/>
+                <w:sz w:val="19"/>
+              </w:rPr>
+              <w:t>A bounded correction is applied to the next round only; omitted usage preserves current behavior.</w:t>
             </w:r>
           </w:p>
         </w:tc>
@@ -3009,7 +3393,84 @@
                 <w:color w:val="20242A"/>
                 <w:sz w:val="19"/>
               </w:rPr>
-              <w:t>The resumed epoch knows the write occurred and still demands a screenshot after it.</w:t>
+              <w:t>The resumed epoch knows the write occurred, preserves monotonic progress ordering, and still demands a later screenshot.</w:t>
+            </w:r>
+          </w:p>
+        </w:tc>
+      </w:tr>
+      <w:tr>
+        <w:tc>
+          <w:tcPr>
+            <w:tcW w:type="dxa" w:w="1450"/>
+            <w:tcMar>
+              <w:top w:w="80" w:type="dxa"/>
+              <w:start w:w="120" w:type="dxa"/>
+              <w:bottom w:w="80" w:type="dxa"/>
+              <w:end w:w="120" w:type="dxa"/>
+            </w:tcMar>
+            <w:vAlign w:val="center"/>
+          </w:tcPr>
+          <w:p>
+            <w:pPr>
+              <w:spacing w:after="0" w:line="259" w:lineRule="auto"/>
+            </w:pPr>
+            <w:r>
+              <w:rPr>
+                <w:rFonts w:ascii="Calibri" w:hAnsi="Calibri"/>
+                <w:color w:val="20242A"/>
+                <w:sz w:val="19"/>
+              </w:rPr>
+              <w:t>Unit</w:t>
+            </w:r>
+          </w:p>
+        </w:tc>
+        <w:tc>
+          <w:tcPr>
+            <w:tcW w:type="dxa" w:w="4500"/>
+            <w:tcMar>
+              <w:top w:w="80" w:type="dxa"/>
+              <w:start w:w="120" w:type="dxa"/>
+              <w:bottom w:w="80" w:type="dxa"/>
+              <w:end w:w="120" w:type="dxa"/>
+            </w:tcMar>
+            <w:vAlign w:val="center"/>
+          </w:tcPr>
+          <w:p>
+            <w:pPr>
+              <w:spacing w:after="0" w:line="259" w:lineRule="auto"/>
+            </w:pPr>
+            <w:r>
+              <w:rPr>
+                <w:rFonts w:ascii="Calibri" w:hAnsi="Calibri"/>
+                <w:color w:val="20242A"/>
+                <w:sz w:val="19"/>
+              </w:rPr>
+              <w:t>Three evidence regions dropped from active context.</w:t>
+            </w:r>
+          </w:p>
+        </w:tc>
+        <w:tc>
+          <w:tcPr>
+            <w:tcW w:type="dxa" w:w="3410"/>
+            <w:tcMar>
+              <w:top w:w="80" w:type="dxa"/>
+              <w:start w:w="120" w:type="dxa"/>
+              <w:bottom w:w="80" w:type="dxa"/>
+              <w:end w:w="120" w:type="dxa"/>
+            </w:tcMar>
+            <w:vAlign w:val="center"/>
+          </w:tcPr>
+          <w:p>
+            <w:pPr>
+              <w:spacing w:after="0" w:line="259" w:lineRule="auto"/>
+            </w:pPr>
+            <w:r>
+              <w:rPr>
+                <w:rFonts w:ascii="Calibri" w:hAnsi="Calibri"/>
+                <w:color w:val="20242A"/>
+                <w:sz w:val="19"/>
+              </w:rPr>
+              <w:t>A capped number of recovery reads for any dropped region returns content and registers progress; repeats and excess reads remain blocked.</w:t>
             </w:r>
           </w:p>
         </w:tc>
@@ -3113,6 +3574,83 @@
                 <w:color w:val="20242A"/>
                 <w:sz w:val="19"/>
               </w:rPr>
+              <w:t>Unit</w:t>
+            </w:r>
+          </w:p>
+        </w:tc>
+        <w:tc>
+          <w:tcPr>
+            <w:tcW w:type="dxa" w:w="4500"/>
+            <w:tcMar>
+              <w:top w:w="80" w:type="dxa"/>
+              <w:start w:w="120" w:type="dxa"/>
+              <w:bottom w:w="80" w:type="dxa"/>
+              <w:end w:w="120" w:type="dxa"/>
+            </w:tcMar>
+            <w:vAlign w:val="center"/>
+          </w:tcPr>
+          <w:p>
+            <w:pPr>
+              <w:spacing w:after="0" w:line="259" w:lineRule="auto"/>
+            </w:pPr>
+            <w:r>
+              <w:rPr>
+                <w:rFonts w:ascii="Calibri" w:hAnsi="Calibri"/>
+                <w:color w:val="20242A"/>
+                <w:sz w:val="19"/>
+              </w:rPr>
+              <w:t>A diagnostic fixture containing known prompt and tool-output text.</w:t>
+            </w:r>
+          </w:p>
+        </w:tc>
+        <w:tc>
+          <w:tcPr>
+            <w:tcW w:type="dxa" w:w="3410"/>
+            <w:tcMar>
+              <w:top w:w="80" w:type="dxa"/>
+              <w:start w:w="120" w:type="dxa"/>
+              <w:bottom w:w="80" w:type="dxa"/>
+              <w:end w:w="120" w:type="dxa"/>
+            </w:tcMar>
+            <w:vAlign w:val="center"/>
+          </w:tcPr>
+          <w:p>
+            <w:pPr>
+              <w:spacing w:after="0" w:line="259" w:lineRule="auto"/>
+            </w:pPr>
+            <w:r>
+              <w:rPr>
+                <w:rFonts w:ascii="Calibri" w:hAnsi="Calibri"/>
+                <w:color w:val="20242A"/>
+                <w:sz w:val="19"/>
+              </w:rPr>
+              <w:t>The structured log record contains no user content, attachment data, or tool payload substrings.</w:t>
+            </w:r>
+          </w:p>
+        </w:tc>
+      </w:tr>
+      <w:tr>
+        <w:tc>
+          <w:tcPr>
+            <w:tcW w:type="dxa" w:w="1450"/>
+            <w:tcMar>
+              <w:top w:w="80" w:type="dxa"/>
+              <w:start w:w="120" w:type="dxa"/>
+              <w:bottom w:w="80" w:type="dxa"/>
+              <w:end w:w="120" w:type="dxa"/>
+            </w:tcMar>
+            <w:vAlign w:val="center"/>
+          </w:tcPr>
+          <w:p>
+            <w:pPr>
+              <w:spacing w:after="0" w:line="259" w:lineRule="auto"/>
+            </w:pPr>
+            <w:r>
+              <w:rPr>
+                <w:rFonts w:ascii="Calibri" w:hAnsi="Calibri"/>
+                <w:color w:val="20242A"/>
+                <w:sz w:val="19"/>
+              </w:rPr>
               <w:t>Integration</w:t>
             </w:r>
           </w:p>
@@ -3138,7 +3676,7 @@
                 <w:color w:val="20242A"/>
                 <w:sz w:val="19"/>
               </w:rPr>
-              <w:t>Long read/search/inspect fixture with more than 80 tool calls.</w:t>
+              <w:t>Long read/search/inspect fixture with more than 80 tool calls and four visual inspections.</w:t>
             </w:r>
           </w:p>
         </w:tc>
@@ -3163,7 +3701,7 @@
                 <w:color w:val="20242A"/>
                 <w:sz w:val="19"/>
               </w:rPr>
-              <w:t>At least one clean handoff occurs; the model completes or reports a real blocker without "no room left" as the first terminal event.</w:t>
+              <w:t>At least one clean handoff occurs; old visual images are reclaimed before hard stop; the model completes or reports a real blocker without "no room left" as the first terminal event.</w:t>
             </w:r>
           </w:p>
         </w:tc>
@@ -3215,7 +3753,7 @@
                 <w:color w:val="20242A"/>
                 <w:sz w:val="19"/>
               </w:rPr>
-              <w:t>Compaction summary fails or does not shrink enough.</w:t>
+              <w:t>Compaction summary fails, does not shrink enough, or its own constrained summarizer request overflows.</w:t>
             </w:r>
           </w:p>
         </w:tc>
@@ -3240,7 +3778,84 @@
                 <w:color w:val="20242A"/>
                 <w:sz w:val="19"/>
               </w:rPr>
-              <w:t>Exactly one bounded recovery path runs, then an actionable stop. No repeated compaction loop.</w:t>
+              <w:t>Exactly one bounded recovery/re-bound path runs, then an actionable stop. No repeated compaction loop.</w:t>
+            </w:r>
+          </w:p>
+        </w:tc>
+      </w:tr>
+      <w:tr>
+        <w:tc>
+          <w:tcPr>
+            <w:tcW w:type="dxa" w:w="1450"/>
+            <w:tcMar>
+              <w:top w:w="80" w:type="dxa"/>
+              <w:start w:w="120" w:type="dxa"/>
+              <w:bottom w:w="80" w:type="dxa"/>
+              <w:end w:w="120" w:type="dxa"/>
+            </w:tcMar>
+            <w:vAlign w:val="center"/>
+          </w:tcPr>
+          <w:p>
+            <w:pPr>
+              <w:spacing w:after="0" w:line="259" w:lineRule="auto"/>
+            </w:pPr>
+            <w:r>
+              <w:rPr>
+                <w:rFonts w:ascii="Calibri" w:hAnsi="Calibri"/>
+                <w:color w:val="20242A"/>
+                <w:sz w:val="19"/>
+              </w:rPr>
+              <w:t>Regression</w:t>
+            </w:r>
+          </w:p>
+        </w:tc>
+        <w:tc>
+          <w:tcPr>
+            <w:tcW w:type="dxa" w:w="4500"/>
+            <w:tcMar>
+              <w:top w:w="80" w:type="dxa"/>
+              <w:start w:w="120" w:type="dxa"/>
+              <w:bottom w:w="80" w:type="dxa"/>
+              <w:end w:w="120" w:type="dxa"/>
+            </w:tcMar>
+            <w:vAlign w:val="center"/>
+          </w:tcPr>
+          <w:p>
+            <w:pPr>
+              <w:spacing w:after="0" w:line="259" w:lineRule="auto"/>
+            </w:pPr>
+            <w:r>
+              <w:rPr>
+                <w:rFonts w:ascii="Calibri" w:hAnsi="Calibri"/>
+                <w:color w:val="20242A"/>
+                <w:sz w:val="19"/>
+              </w:rPr>
+              <w:t>Abort during a running tool call; two long commands share a prefix and are later reclaimed.</w:t>
+            </w:r>
+          </w:p>
+        </w:tc>
+        <w:tc>
+          <w:tcPr>
+            <w:tcW w:type="dxa" w:w="3410"/>
+            <w:tcMar>
+              <w:top w:w="80" w:type="dxa"/>
+              <w:start w:w="120" w:type="dxa"/>
+              <w:bottom w:w="80" w:type="dxa"/>
+              <w:end w:w="120" w:type="dxa"/>
+            </w:tcMar>
+            <w:vAlign w:val="center"/>
+          </w:tcPr>
+          <w:p>
+            <w:pPr>
+              <w:spacing w:after="0" w:line="259" w:lineRule="auto"/>
+            </w:pPr>
+            <w:r>
+              <w:rPr>
+                <w:rFonts w:ascii="Calibri" w:hAnsi="Calibri"/>
+                <w:color w:val="20242A"/>
+                <w:sz w:val="19"/>
+              </w:rPr>
+              <w:t>No false "Interrupted when Anodex closed" record enters history or handoff; distinct command keys/hashes were captured at settlement.</w:t>
             </w:r>
           </w:p>
         </w:tc>
@@ -3334,7 +3949,747 @@
         <w:keepNext/>
       </w:pPr>
       <w:r>
-        <w:t>6. File-level implementation map</w:t>
+        <w:t>6. Review-driven refinements and why</w:t>
+      </w:r>
+    </w:p>
+    <w:p>
+      <w:pPr/>
+      <w:r>
+        <w:rPr>
+          <w:rFonts w:ascii="Calibri" w:hAnsi="Calibri"/>
+        </w:rPr>
+        <w:t>The independent Claude review correctly identified several implementation-level risks. The following decisions incorporate its useful findings while preserving existing Anodex mechanisms that already provide part of the solution.</w:t>
+      </w:r>
+    </w:p>
+    <w:tbl>
+      <w:tblPr>
+        <w:tblStyle w:val="TableGrid"/>
+        <w:tblW w:type="dxa" w:w="9760"/>
+        <w:jc w:val="left"/>
+        <w:tblLayout w:type="fixed"/>
+        <w:tblLook w:firstColumn="1" w:firstRow="1" w:lastColumn="0" w:lastRow="0" w:noHBand="0" w:noVBand="1" w:val="04A0"/>
+        <w:tblInd w:w="120" w:type="dxa"/>
+      </w:tblPr>
+      <w:tblGrid>
+        <w:gridCol w:w="2000"/>
+        <w:gridCol w:w="3600"/>
+        <w:gridCol w:w="4160"/>
+      </w:tblGrid>
+      <w:tr>
+        <w:trPr>
+          <w:tblHeader w:val="true"/>
+        </w:trPr>
+        <w:tc>
+          <w:tcPr>
+            <w:tcW w:type="dxa" w:w="2000"/>
+            <w:shd w:fill="E8EEF5" w:val="clear"/>
+            <w:tcMar>
+              <w:top w:w="80" w:type="dxa"/>
+              <w:start w:w="120" w:type="dxa"/>
+              <w:bottom w:w="80" w:type="dxa"/>
+              <w:end w:w="120" w:type="dxa"/>
+            </w:tcMar>
+            <w:vAlign w:val="center"/>
+          </w:tcPr>
+          <w:p>
+            <w:pPr>
+              <w:spacing w:after="0"/>
+            </w:pPr>
+            <w:r>
+              <w:rPr>
+                <w:rFonts w:ascii="Calibri" w:hAnsi="Calibri"/>
+                <w:b/>
+                <w:color w:val="0B2545"/>
+                <w:sz w:val="19"/>
+              </w:rPr>
+              <w:t>Review finding</w:t>
+            </w:r>
+          </w:p>
+        </w:tc>
+        <w:tc>
+          <w:tcPr>
+            <w:tcW w:type="dxa" w:w="3600"/>
+            <w:shd w:fill="E8EEF5" w:val="clear"/>
+            <w:tcMar>
+              <w:top w:w="80" w:type="dxa"/>
+              <w:start w:w="120" w:type="dxa"/>
+              <w:bottom w:w="80" w:type="dxa"/>
+              <w:end w:w="120" w:type="dxa"/>
+            </w:tcMar>
+            <w:vAlign w:val="center"/>
+          </w:tcPr>
+          <w:p>
+            <w:pPr>
+              <w:spacing w:after="0"/>
+            </w:pPr>
+            <w:r>
+              <w:rPr>
+                <w:rFonts w:ascii="Calibri" w:hAnsi="Calibri"/>
+                <w:b/>
+                <w:color w:val="0B2545"/>
+                <w:sz w:val="19"/>
+              </w:rPr>
+              <w:t>Plan decision</w:t>
+            </w:r>
+          </w:p>
+        </w:tc>
+        <w:tc>
+          <w:tcPr>
+            <w:tcW w:type="dxa" w:w="4160"/>
+            <w:shd w:fill="E8EEF5" w:val="clear"/>
+            <w:tcMar>
+              <w:top w:w="80" w:type="dxa"/>
+              <w:start w:w="120" w:type="dxa"/>
+              <w:bottom w:w="80" w:type="dxa"/>
+              <w:end w:w="120" w:type="dxa"/>
+            </w:tcMar>
+            <w:vAlign w:val="center"/>
+          </w:tcPr>
+          <w:p>
+            <w:pPr>
+              <w:spacing w:after="0"/>
+            </w:pPr>
+            <w:r>
+              <w:rPr>
+                <w:rFonts w:ascii="Calibri" w:hAnsi="Calibri"/>
+                <w:b/>
+                <w:color w:val="0B2545"/>
+                <w:sz w:val="19"/>
+              </w:rPr>
+              <w:t>Why this changed</w:t>
+            </w:r>
+          </w:p>
+        </w:tc>
+      </w:tr>
+      <w:tr>
+        <w:tc>
+          <w:tcPr>
+            <w:tcW w:type="dxa" w:w="2000"/>
+            <w:tcMar>
+              <w:top w:w="80" w:type="dxa"/>
+              <w:start w:w="120" w:type="dxa"/>
+              <w:bottom w:w="80" w:type="dxa"/>
+              <w:end w:w="120" w:type="dxa"/>
+            </w:tcMar>
+            <w:vAlign w:val="center"/>
+          </w:tcPr>
+          <w:p>
+            <w:pPr>
+              <w:spacing w:after="0" w:line="259" w:lineRule="auto"/>
+            </w:pPr>
+            <w:r>
+              <w:rPr>
+                <w:rFonts w:ascii="Calibri" w:hAnsi="Calibri"/>
+                <w:color w:val="20242A"/>
+                <w:sz w:val="19"/>
+              </w:rPr>
+              <w:t>Very narrow 16K proactive window</w:t>
+            </w:r>
+          </w:p>
+        </w:tc>
+        <w:tc>
+          <w:tcPr>
+            <w:tcW w:type="dxa" w:w="3600"/>
+            <w:tcMar>
+              <w:top w:w="80" w:type="dxa"/>
+              <w:start w:w="120" w:type="dxa"/>
+              <w:bottom w:w="80" w:type="dxa"/>
+              <w:end w:w="120" w:type="dxa"/>
+            </w:tcMar>
+            <w:vAlign w:val="center"/>
+          </w:tcPr>
+          <w:p>
+            <w:pPr>
+              <w:spacing w:after="0" w:line="259" w:lineRule="auto"/>
+            </w:pPr>
+            <w:r>
+              <w:rPr>
+                <w:rFonts w:ascii="Calibri" w:hAnsi="Calibri"/>
+                <w:color w:val="20242A"/>
+                <w:sz w:val="19"/>
+              </w:rPr>
+              <w:t>Accepted: replace the fixed 72 percent threshold with a derived reserve-plus-headroom boundary.</w:t>
+            </w:r>
+          </w:p>
+        </w:tc>
+        <w:tc>
+          <w:tcPr>
+            <w:tcW w:type="dxa" w:w="4160"/>
+            <w:tcMar>
+              <w:top w:w="80" w:type="dxa"/>
+              <w:start w:w="120" w:type="dxa"/>
+              <w:bottom w:w="80" w:type="dxa"/>
+              <w:end w:w="120" w:type="dxa"/>
+            </w:tcMar>
+            <w:vAlign w:val="center"/>
+          </w:tcPr>
+          <w:p>
+            <w:pPr>
+              <w:spacing w:after="0" w:line="259" w:lineRule="auto"/>
+            </w:pPr>
+            <w:r>
+              <w:rPr>
+                <w:rFonts w:ascii="Calibri" w:hAnsi="Calibri"/>
+                <w:color w:val="20242A"/>
+                <w:sz w:val="19"/>
+              </w:rPr>
+              <w:t>At 16K the prior early and hard limits are separated by too little room for a normal tool result.</w:t>
+            </w:r>
+          </w:p>
+        </w:tc>
+      </w:tr>
+      <w:tr>
+        <w:tc>
+          <w:tcPr>
+            <w:tcW w:type="dxa" w:w="2000"/>
+            <w:tcMar>
+              <w:top w:w="80" w:type="dxa"/>
+              <w:start w:w="120" w:type="dxa"/>
+              <w:bottom w:w="80" w:type="dxa"/>
+              <w:end w:w="120" w:type="dxa"/>
+            </w:tcMar>
+            <w:vAlign w:val="center"/>
+          </w:tcPr>
+          <w:p>
+            <w:pPr>
+              <w:spacing w:after="0" w:line="259" w:lineRule="auto"/>
+            </w:pPr>
+            <w:r>
+              <w:rPr>
+                <w:rFonts w:ascii="Calibri" w:hAnsi="Calibri"/>
+                <w:color w:val="20242A"/>
+                <w:sz w:val="19"/>
+              </w:rPr>
+              <w:t>Read coverage and progress survive outer cycles</w:t>
+            </w:r>
+          </w:p>
+        </w:tc>
+        <w:tc>
+          <w:tcPr>
+            <w:tcW w:type="dxa" w:w="3600"/>
+            <w:tcMar>
+              <w:top w:w="80" w:type="dxa"/>
+              <w:start w:w="120" w:type="dxa"/>
+              <w:bottom w:w="80" w:type="dxa"/>
+              <w:end w:w="120" w:type="dxa"/>
+            </w:tcMar>
+            <w:vAlign w:val="center"/>
+          </w:tcPr>
+          <w:p>
+            <w:pPr>
+              <w:spacing w:after="0" w:line="259" w:lineRule="auto"/>
+            </w:pPr>
+            <w:r>
+              <w:rPr>
+                <w:rFonts w:ascii="Calibri" w:hAnsi="Calibri"/>
+                <w:color w:val="20242A"/>
+                <w:sz w:val="19"/>
+              </w:rPr>
+              <w:t>Accepted and extended: use a capped recovery-read budget for any dropped evidence region; update coverage and activity ledgers, and seed monotonic counters.</w:t>
+            </w:r>
+          </w:p>
+        </w:tc>
+        <w:tc>
+          <w:tcPr>
+            <w:tcW w:type="dxa" w:w="4160"/>
+            <w:tcMar>
+              <w:top w:w="80" w:type="dxa"/>
+              <w:start w:w="120" w:type="dxa"/>
+              <w:bottom w:w="80" w:type="dxa"/>
+              <w:end w:w="120" w:type="dxa"/>
+            </w:tcMar>
+            <w:vAlign w:val="center"/>
+          </w:tcPr>
+          <w:p>
+            <w:pPr>
+              <w:spacing w:after="0" w:line="259" w:lineRule="auto"/>
+            </w:pPr>
+            <w:r>
+              <w:rPr>
+                <w:rFonts w:ascii="Calibri" w:hAnsi="Calibri"/>
+                <w:color w:val="20242A"/>
+                <w:sz w:val="19"/>
+              </w:rPr>
+              <w:t>A single preselected path cannot predict the next need; broad reset of loop defenses would revive repeated-read churn.</w:t>
+            </w:r>
+          </w:p>
+        </w:tc>
+      </w:tr>
+      <w:tr>
+        <w:tc>
+          <w:tcPr>
+            <w:tcW w:type="dxa" w:w="2000"/>
+            <w:tcMar>
+              <w:top w:w="80" w:type="dxa"/>
+              <w:start w:w="120" w:type="dxa"/>
+              <w:bottom w:w="80" w:type="dxa"/>
+              <w:end w:w="120" w:type="dxa"/>
+            </w:tcMar>
+            <w:vAlign w:val="center"/>
+          </w:tcPr>
+          <w:p>
+            <w:pPr>
+              <w:spacing w:after="0" w:line="259" w:lineRule="auto"/>
+            </w:pPr>
+            <w:r>
+              <w:rPr>
+                <w:rFonts w:ascii="Calibri" w:hAnsi="Calibri"/>
+                <w:color w:val="20242A"/>
+                <w:sz w:val="19"/>
+              </w:rPr>
+              <w:t>Proactive and emergency stops share a UI stop reason</w:t>
+            </w:r>
+          </w:p>
+        </w:tc>
+        <w:tc>
+          <w:tcPr>
+            <w:tcW w:type="dxa" w:w="3600"/>
+            <w:tcMar>
+              <w:top w:w="80" w:type="dxa"/>
+              <w:start w:w="120" w:type="dxa"/>
+              <w:bottom w:w="80" w:type="dxa"/>
+              <w:end w:w="120" w:type="dxa"/>
+            </w:tcMar>
+            <w:vAlign w:val="center"/>
+          </w:tcPr>
+          <w:p>
+            <w:pPr>
+              <w:spacing w:after="0" w:line="259" w:lineRule="auto"/>
+            </w:pPr>
+            <w:r>
+              <w:rPr>
+                <w:rFonts w:ascii="Calibri" w:hAnsi="Calibri"/>
+                <w:color w:val="20242A"/>
+                <w:sz w:val="19"/>
+              </w:rPr>
+              <w:t>Accepted: carry a structured epoch cause for logs and recovery policy while retaining the existing UI reason.</w:t>
+            </w:r>
+          </w:p>
+        </w:tc>
+        <w:tc>
+          <w:tcPr>
+            <w:tcW w:type="dxa" w:w="4160"/>
+            <w:tcMar>
+              <w:top w:w="80" w:type="dxa"/>
+              <w:start w:w="120" w:type="dxa"/>
+              <w:bottom w:w="80" w:type="dxa"/>
+              <w:end w:w="120" w:type="dxa"/>
+            </w:tcMar>
+            <w:vAlign w:val="center"/>
+          </w:tcPr>
+          <w:p>
+            <w:pPr>
+              <w:spacing w:after="0" w:line="259" w:lineRule="auto"/>
+            </w:pPr>
+            <w:r>
+              <w:rPr>
+                <w:rFonts w:ascii="Calibri" w:hAnsi="Calibri"/>
+                <w:color w:val="20242A"/>
+                <w:sz w:val="19"/>
+              </w:rPr>
+              <w:t>The runtime needs a precise control signal without expanding user-facing complexity.</w:t>
+            </w:r>
+          </w:p>
+        </w:tc>
+      </w:tr>
+      <w:tr>
+        <w:tc>
+          <w:tcPr>
+            <w:tcW w:type="dxa" w:w="2000"/>
+            <w:tcMar>
+              <w:top w:w="80" w:type="dxa"/>
+              <w:start w:w="120" w:type="dxa"/>
+              <w:bottom w:w="80" w:type="dxa"/>
+              <w:end w:w="120" w:type="dxa"/>
+            </w:tcMar>
+            <w:vAlign w:val="center"/>
+          </w:tcPr>
+          <w:p>
+            <w:pPr>
+              <w:spacing w:after="0" w:line="259" w:lineRule="auto"/>
+            </w:pPr>
+            <w:r>
+              <w:rPr>
+                <w:rFonts w:ascii="Calibri" w:hAnsi="Calibri"/>
+                <w:color w:val="20242A"/>
+                <w:sz w:val="19"/>
+              </w:rPr>
+              <w:t>Fresh epoch may not shrink or may evict its own handoff</w:t>
+            </w:r>
+          </w:p>
+        </w:tc>
+        <w:tc>
+          <w:tcPr>
+            <w:tcW w:type="dxa" w:w="3600"/>
+            <w:tcMar>
+              <w:top w:w="80" w:type="dxa"/>
+              <w:start w:w="120" w:type="dxa"/>
+              <w:bottom w:w="80" w:type="dxa"/>
+              <w:end w:w="120" w:type="dxa"/>
+            </w:tcMar>
+            <w:vAlign w:val="center"/>
+          </w:tcPr>
+          <w:p>
+            <w:pPr>
+              <w:spacing w:after="0" w:line="259" w:lineRule="auto"/>
+            </w:pPr>
+            <w:r>
+              <w:rPr>
+                <w:rFonts w:ascii="Calibri" w:hAnsi="Calibri"/>
+                <w:color w:val="20242A"/>
+                <w:sz w:val="19"/>
+              </w:rPr>
+              <w:t>Refined and accepted: retain bounded history for ordinary turns, but render a token-capped protected handoff outside the evictable history split; assert measured shrink after rebuild.</w:t>
+            </w:r>
+          </w:p>
+        </w:tc>
+        <w:tc>
+          <w:tcPr>
+            <w:tcW w:type="dxa" w:w="4160"/>
+            <w:tcMar>
+              <w:top w:w="80" w:type="dxa"/>
+              <w:start w:w="120" w:type="dxa"/>
+              <w:bottom w:w="80" w:type="dxa"/>
+              <w:end w:w="120" w:type="dxa"/>
+            </w:tcMar>
+            <w:vAlign w:val="center"/>
+          </w:tcPr>
+          <w:p>
+            <w:pPr>
+              <w:spacing w:after="0" w:line="259" w:lineRule="auto"/>
+            </w:pPr>
+            <w:r>
+              <w:rPr>
+                <w:rFonts w:ascii="Calibri" w:hAnsi="Calibri"/>
+                <w:color w:val="20242A"/>
+                <w:sz w:val="19"/>
+              </w:rPr>
+              <w:t>The runner does append durable history, but each new generation already projects it through bounded history. Replacing history directly would duplicate ownership; allowing the handoff to be summarized would lose deterministic facts.</w:t>
+            </w:r>
+          </w:p>
+        </w:tc>
+      </w:tr>
+      <w:tr>
+        <w:tc>
+          <w:tcPr>
+            <w:tcW w:type="dxa" w:w="2000"/>
+            <w:tcMar>
+              <w:top w:w="80" w:type="dxa"/>
+              <w:start w:w="120" w:type="dxa"/>
+              <w:bottom w:w="80" w:type="dxa"/>
+              <w:end w:w="120" w:type="dxa"/>
+            </w:tcMar>
+            <w:vAlign w:val="center"/>
+          </w:tcPr>
+          <w:p>
+            <w:pPr>
+              <w:spacing w:after="0" w:line="259" w:lineRule="auto"/>
+            </w:pPr>
+            <w:r>
+              <w:rPr>
+                <w:rFonts w:ascii="Calibri" w:hAnsi="Calibri"/>
+                <w:color w:val="20242A"/>
+                <w:sz w:val="19"/>
+              </w:rPr>
+              <w:t>Possible running tool calls at epoch boundary or cancellation</w:t>
+            </w:r>
+          </w:p>
+        </w:tc>
+        <w:tc>
+          <w:tcPr>
+            <w:tcW w:type="dxa" w:w="3600"/>
+            <w:tcMar>
+              <w:top w:w="80" w:type="dxa"/>
+              <w:start w:w="120" w:type="dxa"/>
+              <w:bottom w:w="80" w:type="dxa"/>
+              <w:end w:w="120" w:type="dxa"/>
+            </w:tcMar>
+            <w:vAlign w:val="center"/>
+          </w:tcPr>
+          <w:p>
+            <w:pPr>
+              <w:spacing w:after="0" w:line="259" w:lineRule="auto"/>
+            </w:pPr>
+            <w:r>
+              <w:rPr>
+                <w:rFonts w:ascii="Calibri" w:hAnsi="Calibri"/>
+                <w:color w:val="20242A"/>
+                <w:sz w:val="19"/>
+              </w:rPr>
+              <w:t>Accepted with scope: preserve the settled-only vision boundary, add the vision regression, and make runner handoff construction reject non-terminal calls on cancellation.</w:t>
+            </w:r>
+          </w:p>
+        </w:tc>
+        <w:tc>
+          <w:tcPr>
+            <w:tcW w:type="dxa" w:w="4160"/>
+            <w:tcMar>
+              <w:top w:w="80" w:type="dxa"/>
+              <w:start w:w="120" w:type="dxa"/>
+              <w:bottom w:w="80" w:type="dxa"/>
+              <w:end w:w="120" w:type="dxa"/>
+            </w:tcMar>
+            <w:vAlign w:val="center"/>
+          </w:tcPr>
+          <w:p>
+            <w:pPr>
+              <w:spacing w:after="0" w:line="259" w:lineRule="auto"/>
+            </w:pPr>
+            <w:r>
+              <w:rPr>
+                <w:rFonts w:ascii="Calibri" w:hAnsi="Calibri"/>
+                <w:color w:val="20242A"/>
+                <w:sz w:val="19"/>
+              </w:rPr>
+              <w:t>The proactive break is already reached after sequential tool settlement, but the outer runner can observe running activity during abort.</w:t>
+            </w:r>
+          </w:p>
+        </w:tc>
+      </w:tr>
+      <w:tr>
+        <w:tc>
+          <w:tcPr>
+            <w:tcW w:type="dxa" w:w="2000"/>
+            <w:tcMar>
+              <w:top w:w="80" w:type="dxa"/>
+              <w:start w:w="120" w:type="dxa"/>
+              <w:bottom w:w="80" w:type="dxa"/>
+              <w:end w:w="120" w:type="dxa"/>
+            </w:tcMar>
+            <w:vAlign w:val="center"/>
+          </w:tcPr>
+          <w:p>
+            <w:pPr>
+              <w:spacing w:after="0" w:line="259" w:lineRule="auto"/>
+            </w:pPr>
+            <w:r>
+              <w:rPr>
+                <w:rFonts w:ascii="Calibri" w:hAnsi="Calibri"/>
+                <w:color w:val="20242A"/>
+                <w:sz w:val="19"/>
+              </w:rPr>
+              <w:t>Blind duplicate command suppression</w:t>
+            </w:r>
+          </w:p>
+        </w:tc>
+        <w:tc>
+          <w:tcPr>
+            <w:tcW w:type="dxa" w:w="3600"/>
+            <w:tcMar>
+              <w:top w:w="80" w:type="dxa"/>
+              <w:start w:w="120" w:type="dxa"/>
+              <w:bottom w:w="80" w:type="dxa"/>
+              <w:end w:w="120" w:type="dxa"/>
+            </w:tcMar>
+            <w:vAlign w:val="center"/>
+          </w:tcPr>
+          <w:p>
+            <w:pPr>
+              <w:spacing w:after="0" w:line="259" w:lineRule="auto"/>
+            </w:pPr>
+            <w:r>
+              <w:rPr>
+                <w:rFonts w:ascii="Calibri" w:hAnsi="Calibri"/>
+                <w:color w:val="20242A"/>
+                <w:sz w:val="19"/>
+              </w:rPr>
+              <w:t>Refined: retain normalized command outcomes as evidence, not an unconditional skip rule.</w:t>
+            </w:r>
+          </w:p>
+        </w:tc>
+        <w:tc>
+          <w:tcPr>
+            <w:tcW w:type="dxa" w:w="4160"/>
+            <w:tcMar>
+              <w:top w:w="80" w:type="dxa"/>
+              <w:start w:w="120" w:type="dxa"/>
+              <w:bottom w:w="80" w:type="dxa"/>
+              <w:end w:w="120" w:type="dxa"/>
+            </w:tcMar>
+            <w:vAlign w:val="center"/>
+          </w:tcPr>
+          <w:p>
+            <w:pPr>
+              <w:spacing w:after="0" w:line="259" w:lineRule="auto"/>
+            </w:pPr>
+            <w:r>
+              <w:rPr>
+                <w:rFonts w:ascii="Calibri" w:hAnsi="Calibri"/>
+                <w:color w:val="20242A"/>
+                <w:sz w:val="19"/>
+              </w:rPr>
+              <w:t>A matching command can be safe to repeat, time-sensitive, or required for verification.</w:t>
+            </w:r>
+          </w:p>
+        </w:tc>
+      </w:tr>
+      <w:tr>
+        <w:tc>
+          <w:tcPr>
+            <w:tcW w:type="dxa" w:w="2000"/>
+            <w:tcMar>
+              <w:top w:w="80" w:type="dxa"/>
+              <w:start w:w="120" w:type="dxa"/>
+              <w:bottom w:w="80" w:type="dxa"/>
+              <w:end w:w="120" w:type="dxa"/>
+            </w:tcMar>
+            <w:vAlign w:val="center"/>
+          </w:tcPr>
+          <w:p>
+            <w:pPr>
+              <w:spacing w:after="0" w:line="259" w:lineRule="auto"/>
+            </w:pPr>
+            <w:r>
+              <w:rPr>
+                <w:rFonts w:ascii="Calibri" w:hAnsi="Calibri"/>
+                <w:color w:val="20242A"/>
+                <w:sz w:val="19"/>
+              </w:rPr>
+              <w:t>Fixed image-token estimate and framing estimate</w:t>
+            </w:r>
+          </w:p>
+        </w:tc>
+        <w:tc>
+          <w:tcPr>
+            <w:tcW w:type="dxa" w:w="3600"/>
+            <w:tcMar>
+              <w:top w:w="80" w:type="dxa"/>
+              <w:start w:w="120" w:type="dxa"/>
+              <w:bottom w:w="80" w:type="dxa"/>
+              <w:end w:w="120" w:type="dxa"/>
+            </w:tcMar>
+            <w:vAlign w:val="center"/>
+          </w:tcPr>
+          <w:p>
+            <w:pPr>
+              <w:spacing w:after="0" w:line="259" w:lineRule="auto"/>
+            </w:pPr>
+            <w:r>
+              <w:rPr>
+                <w:rFonts w:ascii="Calibri" w:hAnsi="Calibri"/>
+                <w:color w:val="20242A"/>
+                <w:sz w:val="19"/>
+              </w:rPr>
+              <w:t>Accepted: use already-requested structured usage.prompt_tokens as next-round bounded correction; calibrate per projector only if fixtures still require it.</w:t>
+            </w:r>
+          </w:p>
+        </w:tc>
+        <w:tc>
+          <w:tcPr>
+            <w:tcW w:type="dxa" w:w="4160"/>
+            <w:tcMar>
+              <w:top w:w="80" w:type="dxa"/>
+              <w:start w:w="120" w:type="dxa"/>
+              <w:bottom w:w="80" w:type="dxa"/>
+              <w:end w:w="120" w:type="dxa"/>
+            </w:tcMar>
+            <w:vAlign w:val="center"/>
+          </w:tcPr>
+          <w:p>
+            <w:pPr>
+              <w:spacing w:after="0" w:line="259" w:lineRule="auto"/>
+            </w:pPr>
+            <w:r>
+              <w:rPr>
+                <w:rFonts w:ascii="Calibri" w:hAnsi="Calibri"/>
+                <w:color w:val="20242A"/>
+                <w:sz w:val="19"/>
+              </w:rPr>
+              <w:t>A mandatory startup probe adds latency, while structured stream usage is a stable source when the runtime provides it.</w:t>
+            </w:r>
+          </w:p>
+        </w:tc>
+      </w:tr>
+      <w:tr>
+        <w:tc>
+          <w:tcPr>
+            <w:tcW w:type="dxa" w:w="2000"/>
+            <w:tcMar>
+              <w:top w:w="80" w:type="dxa"/>
+              <w:start w:w="120" w:type="dxa"/>
+              <w:bottom w:w="80" w:type="dxa"/>
+              <w:end w:w="120" w:type="dxa"/>
+            </w:tcMar>
+            <w:vAlign w:val="center"/>
+          </w:tcPr>
+          <w:p>
+            <w:pPr>
+              <w:spacing w:after="0" w:line="259" w:lineRule="auto"/>
+            </w:pPr>
+            <w:r>
+              <w:rPr>
+                <w:rFonts w:ascii="Calibri" w:hAnsi="Calibri"/>
+                <w:color w:val="20242A"/>
+                <w:sz w:val="19"/>
+              </w:rPr>
+              <w:t>Character estimate can disagree with tokenizer</w:t>
+            </w:r>
+          </w:p>
+        </w:tc>
+        <w:tc>
+          <w:tcPr>
+            <w:tcW w:type="dxa" w:w="3600"/>
+            <w:tcMar>
+              <w:top w:w="80" w:type="dxa"/>
+              <w:start w:w="120" w:type="dxa"/>
+              <w:bottom w:w="80" w:type="dxa"/>
+              <w:end w:w="120" w:type="dxa"/>
+            </w:tcMar>
+            <w:vAlign w:val="center"/>
+          </w:tcPr>
+          <w:p>
+            <w:pPr>
+              <w:spacing w:after="0" w:line="259" w:lineRule="auto"/>
+            </w:pPr>
+            <w:r>
+              <w:rPr>
+                <w:rFonts w:ascii="Calibri" w:hAnsi="Calibri"/>
+                <w:color w:val="20242A"/>
+                <w:sz w:val="19"/>
+              </w:rPr>
+              <w:t>Accepted: perform one correction-aware re-bound before terminal diagnosis.</w:t>
+            </w:r>
+          </w:p>
+        </w:tc>
+        <w:tc>
+          <w:tcPr>
+            <w:tcW w:type="dxa" w:w="4160"/>
+            <w:tcMar>
+              <w:top w:w="80" w:type="dxa"/>
+              <w:start w:w="120" w:type="dxa"/>
+              <w:bottom w:w="80" w:type="dxa"/>
+              <w:end w:w="120" w:type="dxa"/>
+            </w:tcMar>
+            <w:vAlign w:val="center"/>
+          </w:tcPr>
+          <w:p>
+            <w:pPr>
+              <w:spacing w:after="0" w:line="259" w:lineRule="auto"/>
+            </w:pPr>
+            <w:r>
+              <w:rPr>
+                <w:rFonts w:ascii="Calibri" w:hAnsi="Calibri"/>
+                <w:color w:val="20242A"/>
+                <w:sz w:val="19"/>
+              </w:rPr>
+              <w:t>A deterministic char-based history projection can be too large for JSON-heavy requests; this is estimator skew, not fixed-overhead dominance.</w:t>
+            </w:r>
+          </w:p>
+        </w:tc>
+      </w:tr>
+    </w:tbl>
+    <w:p>
+      <w:pPr>
+        <w:spacing w:after="0"/>
+      </w:pPr>
+    </w:p>
+    <w:p>
+      <w:pPr>
+        <w:pStyle w:val="Heading1"/>
+        <w:keepNext/>
+      </w:pPr>
+      <w:r>
+        <w:t>7. File-level implementation map</w:t>
       </w:r>
     </w:p>
     <w:p>
@@ -3465,7 +4820,7 @@
                 <w:color w:val="20242A"/>
                 <w:sz w:val="19"/>
               </w:rPr>
-              <w:t>Own the outer continuation decision, epoch transitions, and final user-facing outcome when a run cannot continue.</w:t>
+              <w:t>Own outer continuation, epoch transitions, recovery-read activity accounting, and refusal to derive a handoff from non-terminal calls.</w:t>
             </w:r>
           </w:p>
         </w:tc>
@@ -3517,7 +4872,7 @@
                 <w:color w:val="20242A"/>
                 <w:sz w:val="19"/>
               </w:rPr>
-              <w:t>Expose measured provider-facing budget, include image/tool-call cost, request a safe boundary, and rebuild vision messages from the new epoch.</w:t>
+              <w:t>Expose measured provider-facing budget, consume structured prompt usage for next-round correction, include image/tool-call cost, request a safe boundary, and rebuild vision messages from the new epoch.</w:t>
             </w:r>
           </w:p>
         </w:tc>
@@ -3621,7 +4976,7 @@
                 <w:color w:val="20242A"/>
                 <w:sz w:val="19"/>
               </w:rPr>
-              <w:t>Create the bounded recent tail and fold durable history into a compact model-facing context.</w:t>
+              <w:t>Create the bounded recent tail and fold ordinary durable history into a compact model-facing context; define a protected, token-capped handoff block outside evictable history.</w:t>
             </w:r>
           </w:p>
         </w:tc>
@@ -3700,7 +5055,7 @@
                 <w:color w:val="20242A"/>
                 <w:sz w:val="19"/>
               </w:rPr>
-              <w:t>src/main/tools/turnProgress.ts and tool helpers</w:t>
+              <w:t>src/main/tools/readCoverage.ts, turnProgress.ts, and tool helpers</w:t>
             </w:r>
           </w:p>
         </w:tc>
@@ -3725,7 +5080,7 @@
                 <w:color w:val="20242A"/>
                 <w:sz w:val="19"/>
               </w:rPr>
-              <w:t>Supply completed work, mutation/verification ordering, and settled tool records to the deterministic handoff.</w:t>
+              <w:t>Supply epoch-scoped recovery-read allowance, completed work, monotonic mutation/verification ordering, and settled tool records to the deterministic handoff.</w:t>
             </w:r>
           </w:p>
         </w:tc>
@@ -3846,7 +5201,7 @@
         <w:keepNext/>
       </w:pPr>
       <w:r>
-        <w:t>7. Risks and mitigations</w:t>
+        <w:t>8. Risks and mitigations</w:t>
       </w:r>
     </w:p>
     <w:tbl>
@@ -3996,7 +5351,7 @@
                 <w:color w:val="20242A"/>
                 <w:sz w:val="19"/>
               </w:rPr>
-              <w:t>Make file paths, plan state, completed mutations, approvals, verification requirements, and error facts deterministic fields; use the model summary only as a supplement.</w:t>
+              <w:t>Render a token-capped protected deterministic handoff outside rolling history; use a model summary only as a supplement.</w:t>
             </w:r>
           </w:p>
         </w:tc>
@@ -4021,7 +5376,7 @@
                 <w:color w:val="20242A"/>
                 <w:sz w:val="19"/>
               </w:rPr>
-              <w:t>The most safety-critical facts do not rely on model memory.</w:t>
+              <w:t>The most safety-critical facts cannot be evicted or rewritten by history compaction.</w:t>
             </w:r>
           </w:p>
         </w:tc>
@@ -4150,7 +5505,7 @@
                 <w:color w:val="20242A"/>
                 <w:sz w:val="19"/>
               </w:rPr>
-              <w:t>Persist settlement ids, checkpoints, changed paths, and command outcomes in the handoff.</w:t>
+              <w:t>Persist normalized mutation evidence, checkpoints, changed paths, hashes, and command outcomes; allow verification of a matching command before any retry.</w:t>
             </w:r>
           </w:p>
         </w:tc>
@@ -4175,7 +5530,7 @@
                 <w:color w:val="20242A"/>
                 <w:sz w:val="19"/>
               </w:rPr>
-              <w:t>The next model sees a reliable record of completed side effects.</w:t>
+              <w:t>The next model sees reliable completed side effects without incorrectly suppressing valid repeatable commands.</w:t>
             </w:r>
           </w:p>
         </w:tc>
@@ -4227,7 +5582,7 @@
                 <w:color w:val="20242A"/>
                 <w:sz w:val="19"/>
               </w:rPr>
-              <w:t>Detect this separately and return a configuration-focused message; do not attempt meaningless history compaction.</w:t>
+              <w:t>Use a context-scaled reserve and diagnose only measured fixed-component dominance; re-bound once on known estimator skew first.</w:t>
             </w:r>
           </w:p>
         </w:tc>
@@ -4252,7 +5607,7 @@
                 <w:color w:val="20242A"/>
                 <w:sz w:val="19"/>
               </w:rPr>
-              <w:t>No amount of history pruning can reclaim fixed overhead.</w:t>
+              <w:t>No amount of history pruning can reclaim true fixed overhead, but estimator error is recoverable.</w:t>
             </w:r>
           </w:p>
         </w:tc>
@@ -4423,7 +5778,7 @@
         <w:keepNext/>
       </w:pPr>
       <w:r>
-        <w:t>8. Acceptance criteria</w:t>
+        <w:t>9. Acceptance criteria</w:t>
       </w:r>
     </w:p>
     <w:p>
@@ -4461,7 +5816,7 @@
         <w:rPr>
           <w:rFonts w:ascii="Calibri" w:hAnsi="Calibri"/>
         </w:rPr>
-        <w:t>The resumed task preserves its goal, plan state, completed mutations, approval state, source pointers, and post-change verification requirement.</w:t>
+        <w:t>The resumed task preserves its protected objective, plan state, completed mutations, approval state, source pointers, and post-change verification requirement; no handoff field is silently re-summarized.</w:t>
       </w:r>
     </w:p>
     <w:p>
@@ -4480,7 +5835,7 @@
         <w:rPr>
           <w:rFonts w:ascii="Calibri" w:hAnsi="Calibri"/>
         </w:rPr>
-        <w:t>No second model/server process is loaded. No continuous monitoring, screenshot retention, or telemetry polling is added. The active request becomes smaller after each epoch.</w:t>
+        <w:t>No second model/server process is loaded. No continuous monitoring, screenshot retention, or telemetry polling is added. The active request demonstrably becomes smaller after each accepted epoch.</w:t>
       </w:r>
     </w:p>
     <w:p>
@@ -4499,7 +5854,7 @@
         <w:rPr>
           <w:rFonts w:ascii="Calibri" w:hAnsi="Calibri"/>
         </w:rPr>
-        <w:t>Logs distinguish context capacity, fixed-overhead dominance, summary failure, provider overflow, and runtime termination.</w:t>
+        <w:t>Logs distinguish proactive capacity, in-turn exhaustion, true fixed-overhead dominance, estimator correction/re-bound, summary failure, provider overflow, and runtime termination.</w:t>
       </w:r>
     </w:p>
     <w:p>
@@ -4527,7 +5882,7 @@
         <w:keepNext/>
       </w:pPr>
       <w:r>
-        <w:t>9. Recommended implementation order</w:t>
+        <w:t>10. Recommended implementation order</w:t>
       </w:r>
     </w:p>
     <w:p>
@@ -4536,7 +5891,7 @@
         <w:rPr>
           <w:rFonts w:ascii="Calibri" w:hAnsi="Calibri"/>
         </w:rPr>
-        <w:t>Start with Phase 0 and the test fixtures. The diagnostic shape will tell us exactly whether the next real failure is caused by tool-call volume, images, fixed tool schemas, or provider-specific rendering. Then implement the deterministic handoff and a single fresh-epoch resume path for the vision transport, because it is the constrained path that produced the incident. Only after that path is stable should the text transport adopt the shared seam. Finally, tune thresholds from measured fixtures rather than choosing a production tool-call count by intuition.</w:t>
+        <w:t>Start with Phase 0 diagnostics and structured usage.prompt_tokens capture. Next ship scaled reserve math, correction-aware re-bounding, and image-aware accounting/reclaim, because these improve the existing vision path before introducing handoff state. Define the protected token-capped handoff block and its ownership boundary. Make read coverage, progress, activity, approval, mutation, and settlement ledgers epoch-aware before enabling resume. Then implement measured-shrink rebuild with settled-only, cancellation, and round-zero guardrails. Adopt the shared seam on the text transport only after vision is stable. Tune production thresholds from fixtures rather than intuition.</w:t>
       </w:r>
     </w:p>
     <w:tbl>
@@ -4605,7 +5960,7 @@
         <w:keepNext/>
       </w:pPr>
       <w:r>
-        <w:t>10. External review prompt for Claude</w:t>
+        <w:t>11. External review prompt for Claude</w:t>
       </w:r>
     </w:p>
     <w:p>
@@ -4652,13 +6007,36 @@
                 <w:color w:val="20242A"/>
                 <w:sz w:val="17"/>
               </w:rPr>
-              <w:t>You are reviewing a proposed context-management reliability plan for Anodex, a local-first Electron + React + TypeScript desktop AI assistant. Local text models use node-llama-cpp; vision models use an Anodex-owned llama-server process. A real 16K vision goal run made 86 tool calls and stopped because there was no room for a usable reply, even though the model runtime did not crash.</w:t>
+              <w:t>You have reviewed earlier versions of this Anodex context-management plan. This attached revision incorporates your second review. Please verify the revised decisions rather than re-listing earlier findings that are now addressed.</w:t>
               <w:br/>
               <w:br/>
-              <w:t>Review the attached plan as a senior agent-runtime engineer. Do not propose a rewrite for its own sake. Identify: (1) correctness or protocol flaws in the proposed clean context epoch and handoff design; (2) risks of losing task state, duplicating mutations, or invalidating tool-call history; (3) where the thresholds or token accounting should be more precise; (4) gaps specific to multimodal/vision prompts and image token accounting; (5) tests that are missing; and (6) a minimal implementation order that preserves existing behavior.</w:t>
+              <w:t>Anodex is a local-first Electron + React + TypeScript desktop AI assistant. Local text models use node-llama-cpp; vision models use an Anodex-owned llama-server process. The relevant task is c_fa3b6587-d9f0-430b-9dde-0d8e5a0593ef. If available, inspect its Sandbox Universe task history only as read-only evidence: a 16K vision goal run made 86 tool calls and stopped because there was no room for a usable reply, while the runtime stayed alive.</w:t>
               <w:br/>
               <w:br/>
-              <w:t>Please distinguish must-fix issues from optional improvements. For every recommendation, name the relevant component or interface, explain the failure mode it prevents, and suggest an acceptance test. Do not assume cloud-provider-only behavior; the solution must work with local llama.cpp/llama-server and must not add always-on resource monitoring or expose user content in logs.</w:t>
+              <w:t>Important safety boundary: do not edit, create, delete, rename, format, run, or otherwise alter any Sandbox Universe project files, Anodex source files, settings, task state, conversation history, or test data. Sandbox Universe is an Anodex test fixture; changing it invalidates testing. Your role is review and diagnosis only.</w:t>
+              <w:br/>
+              <w:br/>
+              <w:t>Why this revision changed after your second review:</w:t>
+              <w:br/>
+              <w:t>- We accepted that a handoff inside ordinary history is evictable. The revised plan gives it an exact protected provider-context block, separately token-capped from the selected context size, while ordinary history remains owned by existing bounded-history compaction.</w:t>
+              <w:br/>
+              <w:t>- We accepted that the absolute 4,096 reply reserve is incoherent below 16K. The plan now uses a scaled reserve and only diagnoses fixed-overhead dominance when measured fixed components truly exceed the derived boundary.</w:t>
+              <w:br/>
+              <w:t>- We accepted that char-based history projection can disagree with real tokenization. On measured mismatch, the plan performs one correction-aware re-bound before a terminal verdict.</w:t>
+              <w:br/>
+              <w:t>- We accepted that streamed structured usage.prompt_tokens is already available when supplied by llama-server. It becomes a bounded next-round correction only; it never changes an in-flight request or parses runtime text.</w:t>
+              <w:br/>
+              <w:t>- We accepted that recovery reads cannot be preselected. The plan permits a small capped number for any evidence evicted from active context and updates both coverage and activity ledgers so they count as controlled progress.</w:t>
+              <w:br/>
+              <w:t>- We accepted the runner cancellation and settlement-time capture findings: no handoff over a running call; retain real cancellation reasons; capture command/write identity before argument reclamation.</w:t>
+              <w:br/>
+              <w:t>- We added explicit tests for protected-handoff survival, 4K minimal output, estimator skew, streamed usage correction, recovery-read progress, summarizer failure, cancellation, and colliding long commands.</w:t>
+              <w:br/>
+              <w:br/>
+              <w:t>Assess whether the revised design is now internally coherent. Focus on: (1) protection and token budgeting of the handoff; (2) scaled reserve and fixed-overhead classification; (3) one-rebound correction path and structured usage safety; (4) bounded recovery-read and anti-loop behavior; (5) cancellation, approvals, mutation, and visual-verification safety; and (6) test sufficiency.</w:t>
+              <w:br/>
+              <w:br/>
+              <w:t>Return only new prioritized findings. Do not repeat an earlier finding unless this revision still fails to address it. For each disagreement, label it must-fix or optional, explain the concrete failure mode, name the component, and give an acceptance test. Preserve these constraints: local llama.cpp/llama-server, no always-on resource monitoring, no user content in logs, no normal-recovery model/server reload, and no changes to the Sandbox Universe fixture.</w:t>
             </w:r>
           </w:p>
         </w:tc>

</xml_diff>